<commit_message>
docs: add author credentials Aditya Chowdhury (NMIMS MPSTME) to the research paper
</commit_message>
<xml_diff>
--- a/Linear_Regression_Research_Paper.docx
+++ b/Linear_Regression_Research_Paper.docx
@@ -26,6 +26,33 @@
           <w:sz w:val="26"/>
         </w:rPr>
         <w:t>An Analytical Expansion and Vectorized Optimization Add-on to the California Housing Price Framework</w:t>
+      </w:r>
+    </w:p>
+    <w:p>
+      <w:pPr>
+        <w:jc w:val="center"/>
+      </w:pPr>
+      <w:r>
+        <w:rPr>
+          <w:b/>
+          <w:color w:val="333333"/>
+          <w:sz w:val="24"/>
+        </w:rPr>
+        <w:t>Aditya Chowdhury</w:t>
+      </w:r>
+    </w:p>
+    <w:p>
+      <w:pPr>
+        <w:jc w:val="center"/>
+      </w:pPr>
+      <w:r>
+        <w:rPr>
+          <w:color w:val="4D4D4D"/>
+          <w:sz w:val="22"/>
+        </w:rPr>
+        <w:t>NMIMS MPSTME, Shirpur</w:t>
+        <w:br/>
+        <w:t>May 2026</w:t>
       </w:r>
     </w:p>
     <w:p/>

</xml_diff>